<commit_message>
cap nhat serial ngan ko bi loi xuong dong
</commit_message>
<xml_diff>
--- a/template/RMU Ormazabal FULL CÓ MÁY CẮT.docx
+++ b/template/RMU Ormazabal FULL CÓ MÁY CẮT.docx
@@ -303,9 +303,7 @@
               </w:rPr>
               <w:t>ừng ngăn:</w:t>
             </w:r>
-          </w:p>
-          <w:p>
-            <w:pPr>
+            <w:r>
               <w:rPr>
                 <w:rFonts w:ascii="Times New Roman" w:hAnsi="Times New Roman"/>
                 <w:noProof/>
@@ -313,15 +311,17 @@
                 <w:szCs w:val="28"/>
                 <w:lang w:val="pt-BR"/>
               </w:rPr>
-            </w:pPr>
+              <w:t xml:space="preserve"> </w:t>
+            </w:r>
             <w:r>
               <w:rPr>
                 <w:rFonts w:ascii="Times New Roman" w:hAnsi="Times New Roman"/>
                 <w:noProof/>
                 <w:sz w:val="28"/>
                 <w:szCs w:val="28"/>
-              </w:rPr>
-              <w:t xml:space="preserve">&lt;SERIAL </w:t>
+                <w:lang w:val="pt-BR"/>
+              </w:rPr>
+              <w:br/>
             </w:r>
             <w:r>
               <w:rPr>
@@ -330,16 +330,7 @@
                 <w:sz w:val="28"/>
                 <w:szCs w:val="28"/>
               </w:rPr>
-              <w:t>NGAN</w:t>
-            </w:r>
-            <w:r>
-              <w:rPr>
-                <w:rFonts w:ascii="Times New Roman" w:hAnsi="Times New Roman"/>
-                <w:noProof/>
-                <w:sz w:val="28"/>
-                <w:szCs w:val="28"/>
-              </w:rPr>
-              <w:t>&gt;</w:t>
+              <w:t>&lt;SERIAL NGAN&gt;</w:t>
             </w:r>
           </w:p>
         </w:tc>
@@ -2975,7 +2966,21 @@
               <w:rPr>
                 <w:rFonts w:ascii="Times New Roman" w:hAnsi="Times New Roman"/>
               </w:rPr>
-              <w:t>Motor 24 VDouble output Open</w:t>
+              <w:t xml:space="preserve">Motor 24 VDouble </w:t>
+            </w:r>
+            <w:proofErr w:type="gramStart"/>
+            <w:r>
+              <w:rPr>
+                <w:rFonts w:ascii="Times New Roman" w:hAnsi="Times New Roman"/>
+              </w:rPr>
+              <w:t>output</w:t>
+            </w:r>
+            <w:proofErr w:type="gramEnd"/>
+            <w:r>
+              <w:rPr>
+                <w:rFonts w:ascii="Times New Roman" w:hAnsi="Times New Roman"/>
+              </w:rPr>
+              <w:t xml:space="preserve"> Open</w:t>
             </w:r>
           </w:p>
         </w:tc>
@@ -7715,7 +7720,21 @@
               <w:rPr>
                 <w:rFonts w:ascii="Times New Roman" w:hAnsi="Times New Roman"/>
               </w:rPr>
-              <w:t>Motor 24 VDouble output Open</w:t>
+              <w:t xml:space="preserve">Motor 24 VDouble </w:t>
+            </w:r>
+            <w:proofErr w:type="gramStart"/>
+            <w:r>
+              <w:rPr>
+                <w:rFonts w:ascii="Times New Roman" w:hAnsi="Times New Roman"/>
+              </w:rPr>
+              <w:t>output</w:t>
+            </w:r>
+            <w:proofErr w:type="gramEnd"/>
+            <w:r>
+              <w:rPr>
+                <w:rFonts w:ascii="Times New Roman" w:hAnsi="Times New Roman"/>
+              </w:rPr>
+              <w:t xml:space="preserve"> Open</w:t>
             </w:r>
           </w:p>
         </w:tc>
@@ -12454,7 +12473,21 @@
               <w:rPr>
                 <w:rFonts w:ascii="Times New Roman" w:hAnsi="Times New Roman"/>
               </w:rPr>
-              <w:t>Motor 24 VDouble output Open</w:t>
+              <w:t xml:space="preserve">Motor 24 VDouble </w:t>
+            </w:r>
+            <w:proofErr w:type="gramStart"/>
+            <w:r>
+              <w:rPr>
+                <w:rFonts w:ascii="Times New Roman" w:hAnsi="Times New Roman"/>
+              </w:rPr>
+              <w:t>output</w:t>
+            </w:r>
+            <w:proofErr w:type="gramEnd"/>
+            <w:r>
+              <w:rPr>
+                <w:rFonts w:ascii="Times New Roman" w:hAnsi="Times New Roman"/>
+              </w:rPr>
+              <w:t xml:space="preserve"> Open</w:t>
             </w:r>
           </w:p>
         </w:tc>
@@ -17193,7 +17226,21 @@
               <w:rPr>
                 <w:rFonts w:ascii="Times New Roman" w:hAnsi="Times New Roman"/>
               </w:rPr>
-              <w:t>Motor 24 VDouble output Open</w:t>
+              <w:t xml:space="preserve">Motor 24 VDouble </w:t>
+            </w:r>
+            <w:proofErr w:type="gramStart"/>
+            <w:r>
+              <w:rPr>
+                <w:rFonts w:ascii="Times New Roman" w:hAnsi="Times New Roman"/>
+              </w:rPr>
+              <w:t>output</w:t>
+            </w:r>
+            <w:proofErr w:type="gramEnd"/>
+            <w:r>
+              <w:rPr>
+                <w:rFonts w:ascii="Times New Roman" w:hAnsi="Times New Roman"/>
+              </w:rPr>
+              <w:t xml:space="preserve"> Open</w:t>
             </w:r>
           </w:p>
         </w:tc>
@@ -21864,7 +21911,21 @@
               <w:rPr>
                 <w:rFonts w:ascii="Times New Roman" w:hAnsi="Times New Roman"/>
               </w:rPr>
-              <w:t>Motor 24 VDouble output Open</w:t>
+              <w:t xml:space="preserve">Motor 24 VDouble </w:t>
+            </w:r>
+            <w:proofErr w:type="gramStart"/>
+            <w:r>
+              <w:rPr>
+                <w:rFonts w:ascii="Times New Roman" w:hAnsi="Times New Roman"/>
+              </w:rPr>
+              <w:t>output</w:t>
+            </w:r>
+            <w:proofErr w:type="gramEnd"/>
+            <w:r>
+              <w:rPr>
+                <w:rFonts w:ascii="Times New Roman" w:hAnsi="Times New Roman"/>
+              </w:rPr>
+              <w:t xml:space="preserve"> Open</w:t>
             </w:r>
           </w:p>
         </w:tc>
@@ -25903,7 +25964,21 @@
               <w:rPr>
                 <w:rFonts w:ascii="Times New Roman" w:hAnsi="Times New Roman"/>
               </w:rPr>
-              <w:t>Alarm springs not loaded (not ok)</w:t>
+              <w:t xml:space="preserve">Alarm springs </w:t>
+            </w:r>
+            <w:proofErr w:type="gramStart"/>
+            <w:r>
+              <w:rPr>
+                <w:rFonts w:ascii="Times New Roman" w:hAnsi="Times New Roman"/>
+              </w:rPr>
+              <w:t>not</w:t>
+            </w:r>
+            <w:proofErr w:type="gramEnd"/>
+            <w:r>
+              <w:rPr>
+                <w:rFonts w:ascii="Times New Roman" w:hAnsi="Times New Roman"/>
+              </w:rPr>
+              <w:t xml:space="preserve"> loaded (not ok)</w:t>
             </w:r>
           </w:p>
         </w:tc>
@@ -26515,7 +26590,21 @@
               <w:rPr>
                 <w:rFonts w:ascii="Times New Roman" w:hAnsi="Times New Roman"/>
               </w:rPr>
-              <w:t>PHASE A overcurrent trip (50/51/51_2)</w:t>
+              <w:t xml:space="preserve">PHASE </w:t>
+            </w:r>
+            <w:proofErr w:type="gramStart"/>
+            <w:r>
+              <w:rPr>
+                <w:rFonts w:ascii="Times New Roman" w:hAnsi="Times New Roman"/>
+              </w:rPr>
+              <w:t>A overcurrent</w:t>
+            </w:r>
+            <w:proofErr w:type="gramEnd"/>
+            <w:r>
+              <w:rPr>
+                <w:rFonts w:ascii="Times New Roman" w:hAnsi="Times New Roman"/>
+              </w:rPr>
+              <w:t xml:space="preserve"> trip (50/51/51_2)</w:t>
             </w:r>
           </w:p>
         </w:tc>
@@ -30540,7 +30629,21 @@
               <w:rPr>
                 <w:rFonts w:ascii="Times New Roman" w:hAnsi="Times New Roman"/>
               </w:rPr>
-              <w:t>Alarm springs not loaded (not ok)</w:t>
+              <w:t xml:space="preserve">Alarm springs </w:t>
+            </w:r>
+            <w:proofErr w:type="gramStart"/>
+            <w:r>
+              <w:rPr>
+                <w:rFonts w:ascii="Times New Roman" w:hAnsi="Times New Roman"/>
+              </w:rPr>
+              <w:t>not</w:t>
+            </w:r>
+            <w:proofErr w:type="gramEnd"/>
+            <w:r>
+              <w:rPr>
+                <w:rFonts w:ascii="Times New Roman" w:hAnsi="Times New Roman"/>
+              </w:rPr>
+              <w:t xml:space="preserve"> loaded (not ok)</w:t>
             </w:r>
           </w:p>
         </w:tc>
@@ -31153,7 +31256,21 @@
               <w:rPr>
                 <w:rFonts w:ascii="Times New Roman" w:hAnsi="Times New Roman"/>
               </w:rPr>
-              <w:t>PHASE A overcurrent trip (50/51/51_2)</w:t>
+              <w:t xml:space="preserve">PHASE </w:t>
+            </w:r>
+            <w:proofErr w:type="gramStart"/>
+            <w:r>
+              <w:rPr>
+                <w:rFonts w:ascii="Times New Roman" w:hAnsi="Times New Roman"/>
+              </w:rPr>
+              <w:t>A overcurrent</w:t>
+            </w:r>
+            <w:proofErr w:type="gramEnd"/>
+            <w:r>
+              <w:rPr>
+                <w:rFonts w:ascii="Times New Roman" w:hAnsi="Times New Roman"/>
+              </w:rPr>
+              <w:t xml:space="preserve"> trip (50/51/51_2)</w:t>
             </w:r>
           </w:p>
         </w:tc>
@@ -35178,7 +35295,21 @@
               <w:rPr>
                 <w:rFonts w:ascii="Times New Roman" w:hAnsi="Times New Roman"/>
               </w:rPr>
-              <w:t>Alarm springs not loaded (not ok)</w:t>
+              <w:t xml:space="preserve">Alarm springs </w:t>
+            </w:r>
+            <w:proofErr w:type="gramStart"/>
+            <w:r>
+              <w:rPr>
+                <w:rFonts w:ascii="Times New Roman" w:hAnsi="Times New Roman"/>
+              </w:rPr>
+              <w:t>not</w:t>
+            </w:r>
+            <w:proofErr w:type="gramEnd"/>
+            <w:r>
+              <w:rPr>
+                <w:rFonts w:ascii="Times New Roman" w:hAnsi="Times New Roman"/>
+              </w:rPr>
+              <w:t xml:space="preserve"> loaded (not ok)</w:t>
             </w:r>
           </w:p>
         </w:tc>
@@ -35790,7 +35921,21 @@
               <w:rPr>
                 <w:rFonts w:ascii="Times New Roman" w:hAnsi="Times New Roman"/>
               </w:rPr>
-              <w:t>PHASE A overcurrent trip (50/51/51_2)</w:t>
+              <w:t xml:space="preserve">PHASE </w:t>
+            </w:r>
+            <w:proofErr w:type="gramStart"/>
+            <w:r>
+              <w:rPr>
+                <w:rFonts w:ascii="Times New Roman" w:hAnsi="Times New Roman"/>
+              </w:rPr>
+              <w:t>A overcurrent</w:t>
+            </w:r>
+            <w:proofErr w:type="gramEnd"/>
+            <w:r>
+              <w:rPr>
+                <w:rFonts w:ascii="Times New Roman" w:hAnsi="Times New Roman"/>
+              </w:rPr>
+              <w:t xml:space="preserve"> trip (50/51/51_2)</w:t>
             </w:r>
           </w:p>
         </w:tc>
@@ -39815,7 +39960,21 @@
               <w:rPr>
                 <w:rFonts w:ascii="Times New Roman" w:hAnsi="Times New Roman"/>
               </w:rPr>
-              <w:t>Alarm springs not loaded (not ok)</w:t>
+              <w:t xml:space="preserve">Alarm springs </w:t>
+            </w:r>
+            <w:proofErr w:type="gramStart"/>
+            <w:r>
+              <w:rPr>
+                <w:rFonts w:ascii="Times New Roman" w:hAnsi="Times New Roman"/>
+              </w:rPr>
+              <w:t>not</w:t>
+            </w:r>
+            <w:proofErr w:type="gramEnd"/>
+            <w:r>
+              <w:rPr>
+                <w:rFonts w:ascii="Times New Roman" w:hAnsi="Times New Roman"/>
+              </w:rPr>
+              <w:t xml:space="preserve"> loaded (not ok)</w:t>
             </w:r>
           </w:p>
         </w:tc>
@@ -40427,7 +40586,21 @@
               <w:rPr>
                 <w:rFonts w:ascii="Times New Roman" w:hAnsi="Times New Roman"/>
               </w:rPr>
-              <w:t>PHASE A overcurrent trip (50/51/51_2)</w:t>
+              <w:t xml:space="preserve">PHASE </w:t>
+            </w:r>
+            <w:proofErr w:type="gramStart"/>
+            <w:r>
+              <w:rPr>
+                <w:rFonts w:ascii="Times New Roman" w:hAnsi="Times New Roman"/>
+              </w:rPr>
+              <w:t>A overcurrent</w:t>
+            </w:r>
+            <w:proofErr w:type="gramEnd"/>
+            <w:r>
+              <w:rPr>
+                <w:rFonts w:ascii="Times New Roman" w:hAnsi="Times New Roman"/>
+              </w:rPr>
+              <w:t xml:space="preserve"> trip (50/51/51_2)</w:t>
             </w:r>
           </w:p>
         </w:tc>

</xml_diff>